<commit_message>
added info on pull requests
</commit_message>
<xml_diff>
--- a/Git and GitHub.docx
+++ b/Git and GitHub.docx
@@ -246,7 +246,19 @@
       </w:r>
     </w:p>
     <w:p/>
-    <w:p/>
+    <w:p>
+      <w:r>
+        <w:t xml:space="preserve">Pull request: when a team member is ready to merge his working branch with the main branch, he first sends a request, known as pull request, that needs to be reviewed by other team members before merging </w:t>
+      </w:r>
+      <w:proofErr w:type="gramStart"/>
+      <w:r>
+        <w:t>to</w:t>
+      </w:r>
+      <w:proofErr w:type="gramEnd"/>
+      <w:r>
+        <w:t xml:space="preserve"> the main branch. So, a pull request is a request for review and merger of a branch to the main branch created by the team member who is working on the branch. </w:t>
+      </w:r>
+    </w:p>
     <w:p/>
     <w:p/>
     <w:p/>
@@ -353,14 +365,11 @@
           <w:b/>
           <w:bCs/>
         </w:rPr>
+        <w:lastRenderedPageBreak/>
         <w:t>Hash</w:t>
       </w:r>
       <w:r>
-        <w:t xml:space="preserve">: A number produced by a hash function that represents the contents of a file or another object as a fixed number of digits. Git traditionally uses SHA-1 hashes that are 160 bits long, though modern versions of Git also support SHA-256 (256 bits). One advantage to using </w:t>
-      </w:r>
-      <w:r>
-        <w:lastRenderedPageBreak/>
-        <w:t xml:space="preserve">hashes is that Git can tell whether a file has changed by hashing its contents and comparing the result to the previous hash. If the file time-and-date stamp is changed, but the </w:t>
+        <w:t xml:space="preserve">: A number produced by a hash function that represents the contents of a file or another object as a fixed number of digits. Git traditionally uses SHA-1 hashes that are 160 bits long, though modern versions of Git also support SHA-256 (256 bits). One advantage to using hashes is that Git can tell whether a file has changed by hashing its contents and comparing the result to the previous hash. If the file time-and-date stamp is changed, but the </w:t>
       </w:r>
       <w:proofErr w:type="gramStart"/>
       <w:r>

</xml_diff>